<commit_message>
Sync tai-lieu-dang-web from local (2026-08-09 00:22)
Co-authored-by: Cursor <cursoragent@cursor.com>
</commit_message>
<xml_diff>
--- a/tai-lieu-dang-web/mau-import-bai-giang (7).docx
+++ b/tai-lieu-dang-web/mau-import-bai-giang (7).docx
@@ -527,22 +527,57 @@
     </w:p>
     <w:p>
       <w:r>
-        <w:t xml:space="preserve">// Cách hiển thị: TỰ ĐỘNG theo từng ví dụ (không cần chọn Cách 1/2 trên admin).</w:t>
-      </w:r>
-    </w:p>
-    <w:p>
-      <w:r>
-        <w:t xml:space="preserve">//   - Chỉ có Lời giải phía sau → khung Ví dụ + Lời giải đóng/mở (như cũ).</w:t>
-      </w:r>
-    </w:p>
-    <w:p>
-      <w:r>
-        <w:t xml:space="preserve">//   - Có đáp án / loại câu (A–D, Đáp án:, [đúng sai], …) → tương tác kiểm tra đáp án</w:t>
-      </w:r>
-    </w:p>
-    <w:p>
-      <w:r>
-        <w:t xml:space="preserve">//     (cùng quy tắc mục 5, chỉ đổi “Câu” → “Ví dụ”).</w:t>
+        <w:t xml:space="preserve">// Cách hiển thị trên web (admin): “Cách 1 — Lời giải đóng/mở” hoặc “Cách 2 — Tương tác”.</w:t>
+      </w:r>
+    </w:p>
+    <w:p>
+      <w:r>
+        <w:t xml:space="preserve">// Khi chọn Cách 2, mỗi Ví dụ soạn giống bài tập luyện tập (mục 5) để học sinh làm + kiểm tra đáp án:</w:t>
+      </w:r>
+    </w:p>
+    <w:p>
+      <w:r>
+        <w:t xml:space="preserve">//   Ví dụ 1. &lt;đề&gt;</w:t>
+      </w:r>
+    </w:p>
+    <w:p>
+      <w:r>
+        <w:t xml:space="preserve">//   A. ... B. ... C. ... D. ...</w:t>
+      </w:r>
+    </w:p>
+    <w:p>
+      <w:r>
+        <w:t xml:space="preserve">//   Đáp án: B          (hoặc Lời giải / Chọn B / __A.__ gạch chân)</w:t>
+      </w:r>
+    </w:p>
+    <w:p>
+      <w:r>
+        <w:t xml:space="preserve">//   Lời giải: ...</w:t>
+      </w:r>
+    </w:p>
+    <w:p>
+      <w:r>
+        <w:t xml:space="preserve">//   Ví dụ 2. [đúng sai nhóm]</w:t>
+      </w:r>
+    </w:p>
+    <w:p>
+      <w:r>
+        <w:t xml:space="preserve">//   a) ... b) ... c) ... d) ...</w:t>
+      </w:r>
+    </w:p>
+    <w:p>
+      <w:r>
+        <w:t xml:space="preserve">//   Lời giải</w:t>
+      </w:r>
+    </w:p>
+    <w:p>
+      <w:r>
+        <w:t xml:space="preserve">//   a) Đúng: ...  b) Sai: ...</w:t>
+      </w:r>
+    </w:p>
+    <w:p>
+      <w:r>
+        <w:t xml:space="preserve">//   (Cũng nhận: nhập đáp án, đúng/sai 1 mệnh đề, sắp xếp, kéo thả, điền chỗ trống — xem mục 5)</w:t>
       </w:r>
     </w:p>
     <w:p>

</xml_diff>